<commit_message>
docs(rq1): correct FPR and FNR in five Word reports
</commit_message>
<xml_diff>
--- a/RQ1_Model_Training_xboost/RQ1_docx/Bao_Cao_Thuc_Nghiem_RQ1_XGBoost.docx
+++ b/RQ1_Model_Training_xboost/RQ1_docx/Bao_Cao_Thuc_Nghiem_RQ1_XGBoost.docx
@@ -30,6 +30,15 @@
           <w:sz w:val="40"/>
         </w:rPr>
         <w:t>HỆ THỐNG PHÁT HIỆN XÂM NHẬP MẠNG VỚI XGBOOST</w:t>
+      </w:r>
+    </w:p>
+    <w:p>
+      <w:pPr>
+        <w:spacing w:before="600" w:after="200"/>
+        <w:jc w:val="center"/>
+      </w:pPr>
+      <w:r>
+        <w:t>Đính chính ngày 16/10/2026: FPR đo Benign bị báo thành Attack (0.2324%); FNR đo Attack bị bỏ sót thành Benign (5.7481%). Số liệu lấy từ ma trận test 700,000 flow. Cột tuning cũ được đổi tên thành FNR; chưa có FPR từng cấu hình. Không suy ra FPR live từ số liệu offline.</w:t>
       </w:r>
     </w:p>
     <w:p>
@@ -661,7 +670,7 @@
                 <w:color w:val="FFFFFF"/>
                 <w:sz w:val="20"/>
               </w:rPr>
-              <w:t>FPR Benign (%) [Sub-1.2]</w:t>
+              <w:t xml:space="preserve">FNR Attack (%)</w:t>
             </w:r>
           </w:p>
         </w:tc>
@@ -1981,7 +1990,7 @@
         <w:t xml:space="preserve">• Vùng Underfitting (Depth=4, 6): </w:t>
       </w:r>
       <w:r>
-        <w:t>Ở độ sâu cây nông (depth=4), mô hình chưa đủ khả năng bóc tách các đặc trưng phức tạp của các lớp tấn công hiếm, dẫn đến Test F1-score chỉ đạt 84.56% và tỷ lệ cảnh báo giả FPR lên tới 6.11%.</w:t>
+        <w:t xml:space="preserve">Ở độ sâu cây nông (depth=4), mô hình chưa đủ khả năng bóc tách các đặc trưng phức tạp của các lớp tấn công hiếm, dẫn đến Test F1-score chỉ đạt 84.56% và tỷ lệ bỏ sót tấn công FNR khoảng 6.11%.</w:t>
       </w:r>
       <w:r>
         <w:br w:type="textWrapping"/>
@@ -1993,7 +2002,7 @@
         <w:t xml:space="preserve">• Điểm ngọt ngào tối ưu (Sweet Spot - Depth=8, LR=0.08): </w:t>
       </w:r>
       <w:r>
-        <w:t>Khi nâng độ sâu lên depth=8 kết hợp tốc độ học lr=0.08, mô hình đạt độ cân bằng hoàn hảo: Test F1 đạt 85.81%, Test Precision đạt 90.84%, tỷ lệ FPR trên Benign giảm xuống 5.7481%, và thời gian huấn luyện chỉ mất 160.33 giây (2.67 phút).</w:t>
+        <w:t xml:space="preserve">Khi nâng độ sâu lên depth=8 kết hợp tốc độ học lr=0.08, mô hình đạt độ cân bằng hoàn hảo: Test F1 đạt 85.81%, Test Precision đạt 90.84%, FNR trên Attack là 5.7481%; FPR trên Benign là 0.2324%, và thời gian huấn luyện chỉ mất 160.33 giây (2.67 phút).</w:t>
       </w:r>
       <w:r>
         <w:br w:type="textWrapping"/>
@@ -2377,7 +2386,7 @@
                 <w:color w:val="282828"/>
                 <w:sz w:val="19"/>
               </w:rPr>
-              <w:t>5.7481% (FP=12071, TN=197929)</w:t>
+              <w:t xml:space="preserve">0.2324% (FP=1139, TN=488861)</w:t>
             </w:r>
           </w:p>
         </w:tc>
@@ -7296,7 +7305,7 @@
         <w:t xml:space="preserve">3. Trả lời Sub-RQ 1.2 (Tỷ lệ Cảnh báo sai FPR trên Benign): </w:t>
       </w:r>
       <w:r>
-        <w:t>Mô hình đạt tỷ lệ phát hiện đúng lưu lượng sạch Benign lên tới 99.77% (Recall). Tỷ lệ cảnh báo sai trên lưu lượng bình thường là FPR = 5.7481%, đảm bảo phân biệt vững chắc giữa hành vi người dùng sạch và các cuộc tấn công mạng.</w:t>
+        <w:t xml:space="preserve">Mô hình đạt tỷ lệ phát hiện đúng lưu lượng sạch Benign lên tới 99.77% (Recall). Tỷ lệ cảnh báo sai trên lưu lượng bình thường là FPR = 0.2324%, trên tập test. FNR là 5.7481%; cần đánh giá riêng trên traffic thực tế.</w:t>
       </w:r>
     </w:p>
     <w:p>

</xml_diff>